<commit_message>
feat: Add DOCX template ingest script and deps
Add backend/ingest_template/ingest_templates.py to ingest .docx templates into a MySQL DB. The script loads DOCX text, infers a human-friendly template name, extracts numbered clauses and placeholders, detects repeatable clauses, and inserts templates and clauses into contract_templates and template_clauses tables (idempotent by template_name+version). Adds required dependencies (mysql-connector-python, python-docx) to requirements.txt and updates a sample .docx template. Provides a simple CLI with --templates-dir and --version and skips temporary Word files.
</commit_message>
<xml_diff>
--- a/sample_templates/Non-Disclosure-Agreement-Template.docx
+++ b/sample_templates/Non-Disclosure-Agreement-Template.docx
@@ -138,7 +138,14 @@
         <w:rPr>
           <w:b/>
         </w:rPr>
-        <w:t>Receiving Party:</w:t>
+        <w:t xml:space="preserve">Receiving </w:t>
+      </w:r>
+      <w:proofErr w:type="gramStart"/>
+      <w:r>
+        <w:rPr>
+          <w:b/>
+        </w:rPr>
+        <w:t>Party:</w:t>
       </w:r>
       <w:r>
         <w:t xml:space="preserve"> </w:t>
@@ -161,7 +168,11 @@
         <w:t>}</w:t>
       </w:r>
       <w:r>
-        <w:t xml:space="preserve">, with address at </w:t>
+        <w:t>,</w:t>
+      </w:r>
+      <w:proofErr w:type="gramEnd"/>
+      <w:r>
+        <w:t xml:space="preserve"> with address at </w:t>
       </w:r>
       <w:r>
         <w:t>{</w:t>
@@ -278,9 +289,11 @@
       </w:r>
     </w:p>
     <w:p>
+      <w:proofErr w:type="gramStart"/>
       <w:r>
         <w:t>{{#exclusions}}</w:t>
       </w:r>
+      <w:proofErr w:type="gramEnd"/>
     </w:p>
     <w:p>
       <w:pPr>
@@ -548,12 +561,14 @@
             <w:r>
               <w:t>#signatures</w:t>
             </w:r>
+            <w:proofErr w:type="gramStart"/>
             <w:r>
               <w:t>}</w:t>
             </w:r>
             <w:r>
               <w:t>}{</w:t>
             </w:r>
+            <w:proofErr w:type="gramEnd"/>
             <w:r>
               <w:t>{</w:t>
             </w:r>
@@ -632,12 +647,14 @@
             <w:r>
               <w:t>date</w:t>
             </w:r>
+            <w:proofErr w:type="gramStart"/>
             <w:r>
               <w:t>}</w:t>
             </w:r>
             <w:r>
               <w:t>}{</w:t>
             </w:r>
+            <w:proofErr w:type="gramEnd"/>
             <w:r>
               <w:t>{</w:t>
             </w:r>

</xml_diff>

<commit_message>
feat: Add DB-backed template fetcher and schema
Add backend/fetch_template/fetch_templates.py: a script that loads MySQL creds from .env (via python-dotenv), connects using mysql-connector-python, queries contract_templates, and copies referenced template files into an output/ folder with error handling and a CLI entrypoint. Add database/contract_templates.sql to create the contract_templates table and seed several sample rows. Add a Statement-Of-Work sample template and update the Non-Disclosure-Agreement template binary. Move/rename requirements.txt to backend/requirements.txt and add python-dotenv dependency.
</commit_message>
<xml_diff>
--- a/sample_templates/Non-Disclosure-Agreement-Template.docx
+++ b/sample_templates/Non-Disclosure-Agreement-Template.docx
@@ -49,14 +49,12 @@
         </w:rPr>
         <w:t>{</w:t>
       </w:r>
-      <w:proofErr w:type="spellStart"/>
       <w:r>
         <w:rPr>
           <w:b/>
         </w:rPr>
         <w:t>effectiveDate</w:t>
       </w:r>
-      <w:proofErr w:type="spellEnd"/>
       <w:r>
         <w:rPr>
           <w:b/>
@@ -95,11 +93,9 @@
       <w:r>
         <w:t>{</w:t>
       </w:r>
-      <w:proofErr w:type="spellStart"/>
       <w:r>
         <w:t>disclosingPartyName</w:t>
       </w:r>
-      <w:proofErr w:type="spellEnd"/>
       <w:r>
         <w:t>}</w:t>
       </w:r>
@@ -113,15 +109,7 @@
         <w:t>{</w:t>
       </w:r>
       <w:r>
-        <w:t>{</w:t>
-      </w:r>
-      <w:proofErr w:type="spellStart"/>
-      <w:r>
-        <w:t>disclosingPartyAddress</w:t>
-      </w:r>
-      <w:proofErr w:type="spellEnd"/>
-      <w:r>
-        <w:t>}</w:t>
+        <w:t>{disclosingPartyAddress}</w:t>
       </w:r>
       <w:r>
         <w:t>}</w:t>
@@ -138,14 +126,7 @@
         <w:rPr>
           <w:b/>
         </w:rPr>
-        <w:t xml:space="preserve">Receiving </w:t>
-      </w:r>
-      <w:proofErr w:type="gramStart"/>
-      <w:r>
-        <w:rPr>
-          <w:b/>
-        </w:rPr>
-        <w:t>Party:</w:t>
+        <w:t>Receiving Party:</w:t>
       </w:r>
       <w:r>
         <w:t xml:space="preserve"> </w:t>
@@ -154,39 +135,19 @@
         <w:t>{</w:t>
       </w:r>
       <w:r>
+        <w:t>{receivingPartyName}</w:t>
+      </w:r>
+      <w:r>
+        <w:t>}</w:t>
+      </w:r>
+      <w:r>
+        <w:t xml:space="preserve">, with address at </w:t>
+      </w:r>
+      <w:r>
         <w:t>{</w:t>
       </w:r>
-      <w:proofErr w:type="spellStart"/>
-      <w:r>
-        <w:t>receivingPartyName</w:t>
-      </w:r>
-      <w:proofErr w:type="spellEnd"/>
-      <w:r>
-        <w:t>}</w:t>
-      </w:r>
-      <w:r>
-        <w:t>}</w:t>
-      </w:r>
-      <w:r>
-        <w:t>,</w:t>
-      </w:r>
-      <w:proofErr w:type="gramEnd"/>
-      <w:r>
-        <w:t xml:space="preserve"> with address at </w:t>
-      </w:r>
-      <w:r>
-        <w:t>{</w:t>
-      </w:r>
-      <w:r>
-        <w:t>{</w:t>
-      </w:r>
-      <w:proofErr w:type="spellStart"/>
-      <w:r>
-        <w:t>receivingPartyAddress</w:t>
-      </w:r>
-      <w:proofErr w:type="spellEnd"/>
-      <w:r>
-        <w:t>}</w:t>
+      <w:r>
+        <w:t>{receivingPartyAddress}</w:t>
       </w:r>
       <w:r>
         <w:t>}</w:t>
@@ -260,11 +221,9 @@
       <w:r>
         <w:t>{</w:t>
       </w:r>
-      <w:proofErr w:type="spellStart"/>
       <w:r>
         <w:t>purposeOfDisclosure</w:t>
       </w:r>
-      <w:proofErr w:type="spellEnd"/>
       <w:r>
         <w:t>}</w:t>
       </w:r>
@@ -289,11 +248,9 @@
       </w:r>
     </w:p>
     <w:p>
-      <w:proofErr w:type="gramStart"/>
       <w:r>
         <w:t>{{#exclusions}}</w:t>
       </w:r>
-      <w:proofErr w:type="gramEnd"/>
     </w:p>
     <w:p>
       <w:pPr>
@@ -339,15 +296,7 @@
         <w:t>{</w:t>
       </w:r>
       <w:r>
-        <w:t>{</w:t>
-      </w:r>
-      <w:proofErr w:type="spellStart"/>
-      <w:r>
-        <w:t>terminationCondition</w:t>
-      </w:r>
-      <w:proofErr w:type="spellEnd"/>
-      <w:r>
-        <w:t>}</w:t>
+        <w:t>{terminationCondition}</w:t>
       </w:r>
       <w:r>
         <w:t>}</w:t>
@@ -407,13 +356,8 @@
       <w:r>
         <w:t>{</w:t>
       </w:r>
-      <w:proofErr w:type="spellStart"/>
-      <w:r>
-        <w:t>governingLawJurisdiction</w:t>
-      </w:r>
-      <w:proofErr w:type="spellEnd"/>
-      <w:r>
-        <w:t>}</w:t>
+      <w:r>
+        <w:t>governingLawJurisdiction}</w:t>
       </w:r>
       <w:r>
         <w:t>}</w:t>
@@ -561,14 +505,12 @@
             <w:r>
               <w:t>#signatures</w:t>
             </w:r>
-            <w:proofErr w:type="gramStart"/>
             <w:r>
               <w:t>}</w:t>
             </w:r>
             <w:r>
               <w:t>}{</w:t>
             </w:r>
-            <w:proofErr w:type="gramEnd"/>
             <w:r>
               <w:t>{</w:t>
             </w:r>
@@ -647,14 +589,12 @@
             <w:r>
               <w:t>date</w:t>
             </w:r>
-            <w:proofErr w:type="gramStart"/>
             <w:r>
               <w:t>}</w:t>
             </w:r>
             <w:r>
               <w:t>}{</w:t>
             </w:r>
-            <w:proofErr w:type="gramEnd"/>
             <w:r>
               <w:t>{</w:t>
             </w:r>

</xml_diff>

<commit_message>
feat: Add contract input CLI and update NDA template
Add a new interactive CLI script (backend/app/collect_inputs/collect_inputs.py) that prompts users for contract-specific fields (NDA, MSA, SOW, Service Agreement, Termination Agreement), collects answers into a dict, and saves them as timestamped JSON files in an output directory. The script defines question mappings/placeholders for each contract type and creates the output folder if missing. Also update the sample Non-Disclosure Agreement .docx template (binary change).
</commit_message>
<xml_diff>
--- a/sample_templates/Non-Disclosure-Agreement-Template.docx
+++ b/sample_templates/Non-Disclosure-Agreement-Template.docx
@@ -49,12 +49,14 @@
         </w:rPr>
         <w:t>{</w:t>
       </w:r>
+      <w:proofErr w:type="spellStart"/>
       <w:r>
         <w:rPr>
           <w:b/>
         </w:rPr>
         <w:t>effectiveDate</w:t>
       </w:r>
+      <w:proofErr w:type="spellEnd"/>
       <w:r>
         <w:rPr>
           <w:b/>
@@ -93,9 +95,11 @@
       <w:r>
         <w:t>{</w:t>
       </w:r>
+      <w:proofErr w:type="spellStart"/>
       <w:r>
         <w:t>disclosingPartyName</w:t>
       </w:r>
+      <w:proofErr w:type="spellEnd"/>
       <w:r>
         <w:t>}</w:t>
       </w:r>
@@ -109,7 +113,15 @@
         <w:t>{</w:t>
       </w:r>
       <w:r>
-        <w:t>{disclosingPartyAddress}</w:t>
+        <w:t>{</w:t>
+      </w:r>
+      <w:proofErr w:type="spellStart"/>
+      <w:r>
+        <w:t>disclosingPartyAddress</w:t>
+      </w:r>
+      <w:proofErr w:type="spellEnd"/>
+      <w:r>
+        <w:t>}</w:t>
       </w:r>
       <w:r>
         <w:t>}</w:t>
@@ -126,7 +138,14 @@
         <w:rPr>
           <w:b/>
         </w:rPr>
-        <w:t>Receiving Party:</w:t>
+        <w:t xml:space="preserve">Receiving </w:t>
+      </w:r>
+      <w:proofErr w:type="gramStart"/>
+      <w:r>
+        <w:rPr>
+          <w:b/>
+        </w:rPr>
+        <w:t>Party:</w:t>
       </w:r>
       <w:r>
         <w:t xml:space="preserve"> </w:t>
@@ -135,19 +154,39 @@
         <w:t>{</w:t>
       </w:r>
       <w:r>
-        <w:t>{receivingPartyName}</w:t>
-      </w:r>
+        <w:t>{</w:t>
+      </w:r>
+      <w:proofErr w:type="spellStart"/>
+      <w:r>
+        <w:t>receivingPartyName</w:t>
+      </w:r>
+      <w:proofErr w:type="spellEnd"/>
       <w:r>
         <w:t>}</w:t>
       </w:r>
       <w:r>
-        <w:t xml:space="preserve">, with address at </w:t>
+        <w:t>}</w:t>
+      </w:r>
+      <w:r>
+        <w:t>,</w:t>
+      </w:r>
+      <w:proofErr w:type="gramEnd"/>
+      <w:r>
+        <w:t xml:space="preserve"> with address at </w:t>
       </w:r>
       <w:r>
         <w:t>{</w:t>
       </w:r>
       <w:r>
-        <w:t>{receivingPartyAddress}</w:t>
+        <w:t>{</w:t>
+      </w:r>
+      <w:proofErr w:type="spellStart"/>
+      <w:r>
+        <w:t>receivingPartyAddress</w:t>
+      </w:r>
+      <w:proofErr w:type="spellEnd"/>
+      <w:r>
+        <w:t>}</w:t>
       </w:r>
       <w:r>
         <w:t>}</w:t>
@@ -221,9 +260,11 @@
       <w:r>
         <w:t>{</w:t>
       </w:r>
+      <w:proofErr w:type="spellStart"/>
       <w:r>
         <w:t>purposeOfDisclosure</w:t>
       </w:r>
+      <w:proofErr w:type="spellEnd"/>
       <w:r>
         <w:t>}</w:t>
       </w:r>
@@ -248,9 +289,11 @@
       </w:r>
     </w:p>
     <w:p>
+      <w:proofErr w:type="gramStart"/>
       <w:r>
         <w:t>{{#exclusions}}</w:t>
       </w:r>
+      <w:proofErr w:type="gramEnd"/>
     </w:p>
     <w:p>
       <w:pPr>
@@ -296,7 +339,15 @@
         <w:t>{</w:t>
       </w:r>
       <w:r>
-        <w:t>{terminationCondition}</w:t>
+        <w:t>{</w:t>
+      </w:r>
+      <w:proofErr w:type="spellStart"/>
+      <w:r>
+        <w:t>terminationCondition</w:t>
+      </w:r>
+      <w:proofErr w:type="spellEnd"/>
+      <w:r>
+        <w:t>}</w:t>
       </w:r>
       <w:r>
         <w:t>}</w:t>
@@ -356,8 +407,13 @@
       <w:r>
         <w:t>{</w:t>
       </w:r>
-      <w:r>
-        <w:t>governingLawJurisdiction}</w:t>
+      <w:proofErr w:type="spellStart"/>
+      <w:r>
+        <w:t>governingLawJurisdiction</w:t>
+      </w:r>
+      <w:proofErr w:type="spellEnd"/>
+      <w:r>
+        <w:t>}</w:t>
       </w:r>
       <w:r>
         <w:t>}</w:t>
@@ -505,12 +561,14 @@
             <w:r>
               <w:t>#signatures</w:t>
             </w:r>
+            <w:proofErr w:type="gramStart"/>
             <w:r>
               <w:t>}</w:t>
             </w:r>
             <w:r>
               <w:t>}{</w:t>
             </w:r>
+            <w:proofErr w:type="gramEnd"/>
             <w:r>
               <w:t>{</w:t>
             </w:r>
@@ -589,12 +647,14 @@
             <w:r>
               <w:t>date</w:t>
             </w:r>
+            <w:proofErr w:type="gramStart"/>
             <w:r>
               <w:t>}</w:t>
             </w:r>
             <w:r>
               <w:t>}{</w:t>
             </w:r>
+            <w:proofErr w:type="gramEnd"/>
             <w:r>
               <w:t>{</w:t>
             </w:r>
@@ -1626,6 +1686,54 @@
       <w:u w:val="single"/>
     </w:rPr>
   </w:style>
+  <w:style w:type="paragraph" w:styleId="Header">
+    <w:name w:val="header"/>
+    <w:basedOn w:val="Normal"/>
+    <w:link w:val="HeaderChar"/>
+    <w:uiPriority w:val="99"/>
+    <w:semiHidden/>
+    <w:unhideWhenUsed/>
+    <w:rsid w:val="00836460"/>
+    <w:pPr>
+      <w:tabs>
+        <w:tab w:val="center" w:pos="4513"/>
+        <w:tab w:val="right" w:pos="9026"/>
+      </w:tabs>
+      <w:spacing w:after="0" w:line="240" w:lineRule="auto"/>
+    </w:pPr>
+  </w:style>
+  <w:style w:type="character" w:customStyle="1" w:styleId="HeaderChar">
+    <w:name w:val="Header Char"/>
+    <w:basedOn w:val="DefaultParagraphFont"/>
+    <w:link w:val="Header"/>
+    <w:uiPriority w:val="99"/>
+    <w:semiHidden/>
+    <w:rsid w:val="00836460"/>
+  </w:style>
+  <w:style w:type="paragraph" w:styleId="Footer">
+    <w:name w:val="footer"/>
+    <w:basedOn w:val="Normal"/>
+    <w:link w:val="FooterChar"/>
+    <w:uiPriority w:val="99"/>
+    <w:semiHidden/>
+    <w:unhideWhenUsed/>
+    <w:rsid w:val="00836460"/>
+    <w:pPr>
+      <w:tabs>
+        <w:tab w:val="center" w:pos="4513"/>
+        <w:tab w:val="right" w:pos="9026"/>
+      </w:tabs>
+      <w:spacing w:after="0" w:line="240" w:lineRule="auto"/>
+    </w:pPr>
+  </w:style>
+  <w:style w:type="character" w:customStyle="1" w:styleId="FooterChar">
+    <w:name w:val="Footer Char"/>
+    <w:basedOn w:val="DefaultParagraphFont"/>
+    <w:link w:val="Footer"/>
+    <w:uiPriority w:val="99"/>
+    <w:semiHidden/>
+    <w:rsid w:val="00836460"/>
+  </w:style>
 </w:styles>
 </file>
 

</xml_diff>